<commit_message>
docs: EQ control proposal v1, reword the band list breaking change, remove an empty bullet
Co-Authored-By: Claude Opus 5.5 <noreply@anthropic.com>
</commit_message>
<xml_diff>
--- a/docs/TAS58xx_EQ_Control_Proposal_v1.docx
+++ b/docs/TAS58xx_EQ_Control_Proposal_v1.docx
@@ -3204,24 +3204,37 @@
         <w:rPr/>
       </w:pPr>
       <w:r>
-        <w:rPr/>
-        <w:t>Number Eq Bands setup</w:t>
-      </w:r>
-    </w:p>
-    <w:p>
-      <w:pPr>
-        <w:pStyle w:val="ListBullet"/>
-        <w:numPr>
-          <w:ilvl w:val="0"/>
-          <w:numId w:val="0"/>
-        </w:numPr>
-        <w:spacing w:before="0" w:after="60"/>
-        <w:ind w:hanging="0" w:left="360"/>
-        <w:contextualSpacing/>
-        <w:rPr/>
-      </w:pPr>
-      <w:r>
-        <w:rPr/>
+        <w:t xml:space="preserve">Number EQ bands are defined as </w:t>
+      </w:r>
+      <w:r>
+        <w:rPr>
+          <w:rFonts w:ascii="Consolas" w:hAnsi="Consolas"/>
+          <w:sz w:val="20"/>
+        </w:rPr>
+        <w:t>stereo_bands</w:t>
+      </w:r>
+      <w:r>
+        <w:t xml:space="preserve">, </w:t>
+      </w:r>
+      <w:r>
+        <w:rPr>
+          <w:rFonts w:ascii="Consolas" w:hAnsi="Consolas"/>
+          <w:sz w:val="20"/>
+        </w:rPr>
+        <w:t>left_bands</w:t>
+      </w:r>
+      <w:r>
+        <w:t xml:space="preserve"> and </w:t>
+      </w:r>
+      <w:r>
+        <w:rPr>
+          <w:rFonts w:ascii="Consolas" w:hAnsi="Consolas"/>
+          <w:sz w:val="20"/>
+        </w:rPr>
+        <w:t>right_bands</w:t>
+      </w:r>
+      <w:r>
+        <w:t xml:space="preserve"> lists.</w:t>
       </w:r>
     </w:p>
     <w:p>

</xml_diff>